<commit_message>
avance del nentregable y correcciones del codigo
</commit_message>
<xml_diff>
--- a/Evidencias/Semana_11/Entregable.docx
+++ b/Evidencias/Semana_11/Entregable.docx
@@ -110,7 +110,7 @@
                             </pic:cNvPicPr>
                           </pic:nvPicPr>
                           <pic:blipFill>
-                            <a:blip r:embed="rId5">
+                            <a:blip r:embed="rId7">
                               <a:extLst>
                                 <a:ext uri="{28A0092B-C50C-407E-A947-70E740481C1C}">
                                   <a14:useLocalDpi xmlns:a14="http://schemas.microsoft.com/office/drawing/2010/main" val="0"/>
@@ -150,7 +150,7 @@
                             </pic:cNvPicPr>
                           </pic:nvPicPr>
                           <pic:blipFill>
-                            <a:blip r:embed="rId6">
+                            <a:blip r:embed="rId8">
                               <a:extLst>
                                 <a:ext uri="{28A0092B-C50C-407E-A947-70E740481C1C}">
                                   <a14:useLocalDpi xmlns:a14="http://schemas.microsoft.com/office/drawing/2010/main" val="0"/>
@@ -224,10 +224,10 @@
                     <o:lock v:ext="edit" aspectratio="t"/>
                   </v:shapetype>
                   <v:shape id="Shape 4" o:spid="_x0000_s1029" type="#_x0000_t75" style="position:absolute;width:11334;height:11049;visibility:visible;mso-wrap-style:square" o:preferrelative="f" o:gfxdata="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">
-                    <v:imagedata r:id="rId7" o:title=""/>
+                    <v:imagedata r:id="rId9" o:title=""/>
                   </v:shape>
                   <v:shape id="Shape 5" o:spid="_x0000_s1030" type="#_x0000_t75" style="position:absolute;left:44330;width:11240;height:11334;visibility:visible;mso-wrap-style:square" o:preferrelative="f" o:gfxdata="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">
-                    <v:imagedata r:id="rId8" o:title=""/>
+                    <v:imagedata r:id="rId10" o:title=""/>
                   </v:shape>
                 </v:group>
                 <w10:anchorlock/>
@@ -317,7 +317,7 @@
           <w:sz w:val="22"/>
           <w:szCs w:val="22"/>
         </w:rPr>
-        <w:t xml:space="preserve">Semana </w:t>
+        <w:t xml:space="preserve">Semana 11 – </w:t>
       </w:r>
       <w:r>
         <w:rPr>
@@ -326,7 +326,7 @@
           <w:sz w:val="22"/>
           <w:szCs w:val="22"/>
         </w:rPr>
-        <w:t>11</w:t>
+        <w:t>De</w:t>
       </w:r>
       <w:r>
         <w:rPr>
@@ -335,37 +335,28 @@
           <w:sz w:val="22"/>
           <w:szCs w:val="22"/>
         </w:rPr>
-        <w:t xml:space="preserve"> – </w:t>
-      </w:r>
-      <w:r>
+        <w:t>sarrollo de interfaz web responsive (enfocada a móvil)</w:t>
+      </w:r>
+    </w:p>
+    <w:p>
+      <w:pPr>
+        <w:pStyle w:val="Ttulo1"/>
+        <w:spacing w:after="11"/>
+        <w:ind w:right="200"/>
         <w:rPr>
           <w:rFonts w:eastAsia="Arial" w:cs="Arial"/>
           <w:color w:val="000000"/>
           <w:sz w:val="22"/>
           <w:szCs w:val="22"/>
         </w:rPr>
-        <w:t>desarrollo de interfaz web responsive (enfocada a móvil)</w:t>
-      </w:r>
-    </w:p>
-    <w:p>
-      <w:pPr>
-        <w:pStyle w:val="Ttulo1"/>
-        <w:spacing w:after="11"/>
-        <w:ind w:right="200"/>
+      </w:pPr>
+      <w:r>
         <w:rPr>
           <w:rFonts w:eastAsia="Arial" w:cs="Arial"/>
           <w:color w:val="000000"/>
           <w:sz w:val="22"/>
           <w:szCs w:val="22"/>
         </w:rPr>
-      </w:pPr>
-      <w:r>
-        <w:rPr>
-          <w:rFonts w:eastAsia="Arial" w:cs="Arial"/>
-          <w:color w:val="000000"/>
-          <w:sz w:val="22"/>
-          <w:szCs w:val="22"/>
-        </w:rPr>
         <w:t>Ingeniería en Sistemas Computacionales Cuarto semestre</w:t>
       </w:r>
     </w:p>
@@ -414,19 +405,7 @@
         <w:rPr>
           <w:rFonts w:ascii="Arial" w:eastAsia="Arial" w:hAnsi="Arial" w:cs="Arial"/>
         </w:rPr>
-        <w:t xml:space="preserve">Fecha de entrega: </w:t>
-      </w:r>
-      <w:r>
-        <w:rPr>
-          <w:rFonts w:ascii="Arial" w:eastAsia="Arial" w:hAnsi="Arial" w:cs="Arial"/>
-        </w:rPr>
-        <w:t>26</w:t>
-      </w:r>
-      <w:r>
-        <w:rPr>
-          <w:rFonts w:ascii="Arial" w:eastAsia="Arial" w:hAnsi="Arial" w:cs="Arial"/>
-        </w:rPr>
-        <w:t xml:space="preserve"> de abril de 2026</w:t>
+        <w:t>Fecha de entrega: 26 de abril de 2026</w:t>
       </w:r>
     </w:p>
     <w:p>
@@ -530,18 +509,70 @@
         <w:jc w:val="both"/>
       </w:pPr>
       <w:r>
-        <w:t>Esta practica consiste en la elaboración de una interfaz web empleando en diseño responsive para que se tenga una correcta apreciación desde cualquier dispositivo móvil, un aspecto muy importante en el desarrollo ya que mejora la experiencia del usuario y hace que nuestro trabajo se vea de una mejor calidad. En esta práctica se aplican estos conceptos de programación permitiéndonos ampliar nuestros conocimientos.</w:t>
+        <w:t>Esta práctica consiste en la elaboración de una interfaz web con diseño adaptable (responsive), asegurando su correcta apreciación desde cualquier dispositivo. La implementación de estas técnicas es vital en el desarrollo web actual, ya que eleva la calidad del proyecto y mejora significativamente la experiencia del usuario. El objetivo principal es poner en práctica conceptos avanzados de programación para consolidar el aprendizaje en el área del diseño web funcional.</w:t>
+      </w:r>
+    </w:p>
+    <w:p>
+      <w:pPr>
+        <w:pStyle w:val="Ttulo1"/>
+      </w:pPr>
+      <w:r>
+        <w:t xml:space="preserve">Desarrollo </w:t>
+      </w:r>
+    </w:p>
+    <w:p>
+      <w:pPr>
+        <w:pStyle w:val="Ttulo2"/>
+      </w:pPr>
+      <w:r>
+        <w:t>Explicación del sistema</w:t>
+      </w:r>
+      <w:r>
+        <w:t xml:space="preserve">: </w:t>
+      </w:r>
+    </w:p>
+    <w:p>
+      <w:pPr>
+        <w:pStyle w:val="Ttulo3"/>
+      </w:pPr>
+      <w:r>
+        <w:t>Este es un sistema que nos facilita la organización de gastos contemplando los ingresos y los egresos que se tienen, esta aplicación nos permit</w:t>
+      </w:r>
+      <w:r>
+        <w:t xml:space="preserve">e tener un mejor manejo de nuestros ingresos y llevar un buen control de nuestros gastos. </w:t>
+      </w:r>
+    </w:p>
+    <w:p>
+      <w:pPr>
+        <w:pStyle w:val="Ttulo3"/>
+      </w:pPr>
+      <w:r>
+        <w:t xml:space="preserve">Para esta practica solo se solicitó que se creara la interfaz web por lo que la explicación estará enfocada al código que se realizó para lograr esto. </w:t>
+      </w:r>
+    </w:p>
+    <w:p>
+      <w:pPr>
+        <w:pStyle w:val="Ttulo3"/>
+      </w:pPr>
+      <w:r>
+        <w:t>Iniciamos</w:t>
+      </w:r>
+      <w:r>
+        <w:t xml:space="preserve"> colocando los datos que se apreciaran en la pagina utilizando php </w:t>
+      </w:r>
+      <w:r>
+        <w:t xml:space="preserve">para continuar haciendo la interfaz utilizando </w:t>
+      </w:r>
+      <w:proofErr w:type="spellStart"/>
+      <w:r>
+        <w:t>html</w:t>
+      </w:r>
+      <w:proofErr w:type="spellEnd"/>
+      <w:r>
+        <w:t xml:space="preserve">. </w:t>
       </w:r>
     </w:p>
     <w:p/>
-    <w:p>
-      <w:pPr>
-        <w:pStyle w:val="Ttulo1"/>
-      </w:pPr>
-      <w:r>
-        <w:t xml:space="preserve">Desarrollo </w:t>
-      </w:r>
-    </w:p>
     <w:p>
       <w:pPr>
         <w:pStyle w:val="Prrafodelista"/>
@@ -551,23 +582,6 @@
         </w:numPr>
       </w:pPr>
       <w:r>
-        <w:t xml:space="preserve">Explicación del sistema </w:t>
-      </w:r>
-    </w:p>
-    <w:p>
-      <w:r>
-        <w:t xml:space="preserve">Este es un sistema que nos facilita la organización de gastos contemplando los ingresos y los egresos que se tienen, esta aplicación nos permite </w:t>
-      </w:r>
-    </w:p>
-    <w:p>
-      <w:pPr>
-        <w:pStyle w:val="Prrafodelista"/>
-        <w:numPr>
-          <w:ilvl w:val="0"/>
-          <w:numId w:val="1"/>
-        </w:numPr>
-      </w:pPr>
-      <w:r>
         <w:t xml:space="preserve">Capturas de pantalla (en celular o en modo </w:t>
       </w:r>
       <w:proofErr w:type="spellStart"/>
@@ -596,6 +610,7 @@
       </w:r>
     </w:p>
     <w:sectPr>
+      <w:headerReference w:type="default" r:id="rId11"/>
       <w:pgSz w:w="12240" w:h="15840"/>
       <w:pgMar w:top="1417" w:right="1701" w:bottom="1417" w:left="1701" w:header="708" w:footer="708" w:gutter="0"/>
       <w:cols w:space="708"/>
@@ -603,6 +618,98 @@
     </w:sectPr>
   </w:body>
 </w:document>
+</file>
+
+<file path=word/endnotes.xml><?xml version="1.0" encoding="utf-8"?>
+<w:endnotes xmlns:wpc="http://schemas.microsoft.com/office/word/2010/wordprocessingCanvas" xmlns:cx="http://schemas.microsoft.com/office/drawing/2014/chartex" xmlns:cx1="http://schemas.microsoft.com/office/drawing/2015/9/8/chartex" xmlns:cx2="http://schemas.microsoft.com/office/drawing/2015/10/21/chartex" xmlns:cx3="http://schemas.microsoft.com/office/drawing/2016/5/9/chartex" xmlns:cx4="http://schemas.microsoft.com/office/drawing/2016/5/10/chartex" xmlns:cx5="http://schemas.microsoft.com/office/drawing/2016/5/11/chartex" xmlns:cx6="http://schemas.microsoft.com/office/drawing/2016/5/12/chartex" xmlns:cx7="http://schemas.microsoft.com/office/drawing/2016/5/13/chartex" xmlns:cx8="http://schemas.microsoft.com/office/drawing/2016/5/14/chartex" xmlns:mc="http://schemas.openxmlformats.org/markup-compatibility/2006" xmlns:aink="http://schemas.microsoft.com/office/drawing/2016/ink" xmlns:am3d="http://schemas.microsoft.com/office/drawing/2017/model3d" xmlns:o="urn:schemas-microsoft-com:office:office" xmlns:r="http://schemas.openxmlformats.org/officeDocument/2006/relationships" xmlns:m="http://schemas.openxmlformats.org/officeDocument/2006/math" xmlns:v="urn:schemas-microsoft-com:vml" xmlns:wp14="http://schemas.microsoft.com/office/word/2010/wordprocessingDrawing" xmlns:wp="http://schemas.openxmlformats.org/drawingml/2006/wordprocessingDrawing" xmlns:w10="urn:schemas-microsoft-com:office:word" xmlns:w="http://schemas.openxmlformats.org/wordprocessingml/2006/main" xmlns:w14="http://schemas.microsoft.com/office/word/2010/wordml" xmlns:w15="http://schemas.microsoft.com/office/word/2012/wordml" xmlns:w16cex="http://schemas.microsoft.com/office/word/2018/wordml/cex" xmlns:w16cid="http://schemas.microsoft.com/office/word/2016/wordml/cid" xmlns:w16="http://schemas.microsoft.com/office/word/2018/wordml" xmlns:w16sdtdh="http://schemas.microsoft.com/office/word/2020/wordml/sdtdatahash" xmlns:w16se="http://schemas.microsoft.com/office/word/2015/wordml/symex" xmlns:wpg="http://schemas.microsoft.com/office/word/2010/wordprocessingGroup" xmlns:wpi="http://schemas.microsoft.com/office/word/2010/wordprocessingInk" xmlns:wne="http://schemas.microsoft.com/office/word/2006/wordml" xmlns:wps="http://schemas.microsoft.com/office/word/2010/wordprocessingShape" mc:Ignorable="w14 w15 w16se w16cid w16 w16cex w16sdtdh wp14">
+  <w:endnote w:type="separator" w:id="-1">
+    <w:p>
+      <w:pPr>
+        <w:spacing w:after="0" w:line="240" w:lineRule="auto"/>
+      </w:pPr>
+      <w:r>
+        <w:separator/>
+      </w:r>
+    </w:p>
+  </w:endnote>
+  <w:endnote w:type="continuationSeparator" w:id="0">
+    <w:p>
+      <w:pPr>
+        <w:spacing w:after="0" w:line="240" w:lineRule="auto"/>
+      </w:pPr>
+      <w:r>
+        <w:continuationSeparator/>
+      </w:r>
+    </w:p>
+  </w:endnote>
+</w:endnotes>
+</file>
+
+<file path=word/footnotes.xml><?xml version="1.0" encoding="utf-8"?>
+<w:footnotes xmlns:wpc="http://schemas.microsoft.com/office/word/2010/wordprocessingCanvas" xmlns:cx="http://schemas.microsoft.com/office/drawing/2014/chartex" xmlns:cx1="http://schemas.microsoft.com/office/drawing/2015/9/8/chartex" xmlns:cx2="http://schemas.microsoft.com/office/drawing/2015/10/21/chartex" xmlns:cx3="http://schemas.microsoft.com/office/drawing/2016/5/9/chartex" xmlns:cx4="http://schemas.microsoft.com/office/drawing/2016/5/10/chartex" xmlns:cx5="http://schemas.microsoft.com/office/drawing/2016/5/11/chartex" xmlns:cx6="http://schemas.microsoft.com/office/drawing/2016/5/12/chartex" xmlns:cx7="http://schemas.microsoft.com/office/drawing/2016/5/13/chartex" xmlns:cx8="http://schemas.microsoft.com/office/drawing/2016/5/14/chartex" xmlns:mc="http://schemas.openxmlformats.org/markup-compatibility/2006" xmlns:aink="http://schemas.microsoft.com/office/drawing/2016/ink" xmlns:am3d="http://schemas.microsoft.com/office/drawing/2017/model3d" xmlns:o="urn:schemas-microsoft-com:office:office" xmlns:r="http://schemas.openxmlformats.org/officeDocument/2006/relationships" xmlns:m="http://schemas.openxmlformats.org/officeDocument/2006/math" xmlns:v="urn:schemas-microsoft-com:vml" xmlns:wp14="http://schemas.microsoft.com/office/word/2010/wordprocessingDrawing" xmlns:wp="http://schemas.openxmlformats.org/drawingml/2006/wordprocessingDrawing" xmlns:w10="urn:schemas-microsoft-com:office:word" xmlns:w="http://schemas.openxmlformats.org/wordprocessingml/2006/main" xmlns:w14="http://schemas.microsoft.com/office/word/2010/wordml" xmlns:w15="http://schemas.microsoft.com/office/word/2012/wordml" xmlns:w16cex="http://schemas.microsoft.com/office/word/2018/wordml/cex" xmlns:w16cid="http://schemas.microsoft.com/office/word/2016/wordml/cid" xmlns:w16="http://schemas.microsoft.com/office/word/2018/wordml" xmlns:w16sdtdh="http://schemas.microsoft.com/office/word/2020/wordml/sdtdatahash" xmlns:w16se="http://schemas.microsoft.com/office/word/2015/wordml/symex" xmlns:wpg="http://schemas.microsoft.com/office/word/2010/wordprocessingGroup" xmlns:wpi="http://schemas.microsoft.com/office/word/2010/wordprocessingInk" xmlns:wne="http://schemas.microsoft.com/office/word/2006/wordml" xmlns:wps="http://schemas.microsoft.com/office/word/2010/wordprocessingShape" mc:Ignorable="w14 w15 w16se w16cid w16 w16cex w16sdtdh wp14">
+  <w:footnote w:type="separator" w:id="-1">
+    <w:p>
+      <w:pPr>
+        <w:spacing w:after="0" w:line="240" w:lineRule="auto"/>
+      </w:pPr>
+      <w:r>
+        <w:separator/>
+      </w:r>
+    </w:p>
+  </w:footnote>
+  <w:footnote w:type="continuationSeparator" w:id="0">
+    <w:p>
+      <w:pPr>
+        <w:spacing w:after="0" w:line="240" w:lineRule="auto"/>
+      </w:pPr>
+      <w:r>
+        <w:continuationSeparator/>
+      </w:r>
+    </w:p>
+  </w:footnote>
+</w:footnotes>
+</file>
+
+<file path=word/header1.xml><?xml version="1.0" encoding="utf-8"?>
+<w:hdr xmlns:wpc="http://schemas.microsoft.com/office/word/2010/wordprocessingCanvas" xmlns:cx="http://schemas.microsoft.com/office/drawing/2014/chartex" xmlns:cx1="http://schemas.microsoft.com/office/drawing/2015/9/8/chartex" xmlns:cx2="http://schemas.microsoft.com/office/drawing/2015/10/21/chartex" xmlns:cx3="http://schemas.microsoft.com/office/drawing/2016/5/9/chartex" xmlns:cx4="http://schemas.microsoft.com/office/drawing/2016/5/10/chartex" xmlns:cx5="http://schemas.microsoft.com/office/drawing/2016/5/11/chartex" xmlns:cx6="http://schemas.microsoft.com/office/drawing/2016/5/12/chartex" xmlns:cx7="http://schemas.microsoft.com/office/drawing/2016/5/13/chartex" xmlns:cx8="http://schemas.microsoft.com/office/drawing/2016/5/14/chartex" xmlns:mc="http://schemas.openxmlformats.org/markup-compatibility/2006" xmlns:aink="http://schemas.microsoft.com/office/drawing/2016/ink" xmlns:am3d="http://schemas.microsoft.com/office/drawing/2017/model3d" xmlns:o="urn:schemas-microsoft-com:office:office" xmlns:r="http://schemas.openxmlformats.org/officeDocument/2006/relationships" xmlns:m="http://schemas.openxmlformats.org/officeDocument/2006/math" xmlns:v="urn:schemas-microsoft-com:vml" xmlns:wp14="http://schemas.microsoft.com/office/word/2010/wordprocessingDrawing" xmlns:wp="http://schemas.openxmlformats.org/drawingml/2006/wordprocessingDrawing" xmlns:w10="urn:schemas-microsoft-com:office:word" xmlns:w="http://schemas.openxmlformats.org/wordprocessingml/2006/main" xmlns:w14="http://schemas.microsoft.com/office/word/2010/wordml" xmlns:w15="http://schemas.microsoft.com/office/word/2012/wordml" xmlns:w16cex="http://schemas.microsoft.com/office/word/2018/wordml/cex" xmlns:w16cid="http://schemas.microsoft.com/office/word/2016/wordml/cid" xmlns:w16="http://schemas.microsoft.com/office/word/2018/wordml" xmlns:w16sdtdh="http://schemas.microsoft.com/office/word/2020/wordml/sdtdatahash" xmlns:w16se="http://schemas.microsoft.com/office/word/2015/wordml/symex" xmlns:wpg="http://schemas.microsoft.com/office/word/2010/wordprocessingGroup" xmlns:wpi="http://schemas.microsoft.com/office/word/2010/wordprocessingInk" xmlns:wne="http://schemas.microsoft.com/office/word/2006/wordml" xmlns:wps="http://schemas.microsoft.com/office/word/2010/wordprocessingShape" mc:Ignorable="w14 w15 w16se w16cid w16 w16cex w16sdtdh wp14">
+  <w:sdt>
+    <w:sdtPr>
+      <w:id w:val="426003768"/>
+      <w:docPartObj>
+        <w:docPartGallery w:val="Page Numbers (Top of Page)"/>
+        <w:docPartUnique/>
+      </w:docPartObj>
+    </w:sdtPr>
+    <w:sdtContent>
+      <w:p>
+        <w:pPr>
+          <w:pStyle w:val="Encabezado"/>
+          <w:jc w:val="right"/>
+        </w:pPr>
+        <w:r>
+          <w:fldChar w:fldCharType="begin"/>
+        </w:r>
+        <w:r>
+          <w:instrText>PAGE   \* MERGEFORMAT</w:instrText>
+        </w:r>
+        <w:r>
+          <w:fldChar w:fldCharType="separate"/>
+        </w:r>
+        <w:r>
+          <w:t>2</w:t>
+        </w:r>
+        <w:r>
+          <w:fldChar w:fldCharType="end"/>
+        </w:r>
+      </w:p>
+    </w:sdtContent>
+  </w:sdt>
+  <w:p>
+    <w:pPr>
+      <w:pStyle w:val="Encabezado"/>
+    </w:pPr>
+  </w:p>
+</w:hdr>
 </file>
 
 <file path=word/numbering.xml><?xml version="1.0" encoding="utf-8"?>
@@ -1159,6 +1266,51 @@
       <w:szCs w:val="40"/>
     </w:rPr>
   </w:style>
+  <w:style w:type="paragraph" w:styleId="Ttulo2">
+    <w:name w:val="heading 2"/>
+    <w:basedOn w:val="Normal"/>
+    <w:next w:val="Normal"/>
+    <w:link w:val="Ttulo2Car"/>
+    <w:uiPriority w:val="9"/>
+    <w:unhideWhenUsed/>
+    <w:qFormat/>
+    <w:rsid w:val="003B1732"/>
+    <w:pPr>
+      <w:keepNext/>
+      <w:keepLines/>
+      <w:spacing w:before="40" w:after="0" w:line="257" w:lineRule="auto"/>
+      <w:contextualSpacing/>
+      <w:jc w:val="both"/>
+      <w:outlineLvl w:val="1"/>
+    </w:pPr>
+    <w:rPr>
+      <w:rFonts w:ascii="Arial" w:eastAsiaTheme="majorEastAsia" w:hAnsi="Arial" w:cstheme="majorBidi"/>
+      <w:sz w:val="24"/>
+      <w:szCs w:val="26"/>
+    </w:rPr>
+  </w:style>
+  <w:style w:type="paragraph" w:styleId="Ttulo3">
+    <w:name w:val="heading 3"/>
+    <w:basedOn w:val="Normal"/>
+    <w:next w:val="Normal"/>
+    <w:link w:val="Ttulo3Car"/>
+    <w:uiPriority w:val="9"/>
+    <w:unhideWhenUsed/>
+    <w:qFormat/>
+    <w:rsid w:val="003B1732"/>
+    <w:pPr>
+      <w:keepNext/>
+      <w:keepLines/>
+      <w:spacing w:before="40" w:after="0" w:line="257" w:lineRule="auto"/>
+      <w:contextualSpacing/>
+      <w:jc w:val="both"/>
+      <w:outlineLvl w:val="2"/>
+    </w:pPr>
+    <w:rPr>
+      <w:rFonts w:ascii="Arial" w:eastAsiaTheme="majorEastAsia" w:hAnsi="Arial" w:cstheme="majorBidi"/>
+      <w:szCs w:val="24"/>
+    </w:rPr>
+  </w:style>
   <w:style w:type="character" w:default="1" w:styleId="Fuentedeprrafopredeter">
     <w:name w:val="Default Paragraph Font"/>
     <w:uiPriority w:val="1"/>
@@ -1212,6 +1364,91 @@
       <w:ind w:left="720"/>
       <w:contextualSpacing/>
     </w:pPr>
+  </w:style>
+  <w:style w:type="paragraph" w:styleId="Encabezado">
+    <w:name w:val="header"/>
+    <w:basedOn w:val="Normal"/>
+    <w:link w:val="EncabezadoCar"/>
+    <w:uiPriority w:val="99"/>
+    <w:unhideWhenUsed/>
+    <w:rsid w:val="00D13A4D"/>
+    <w:pPr>
+      <w:tabs>
+        <w:tab w:val="center" w:pos="4419"/>
+        <w:tab w:val="right" w:pos="8838"/>
+      </w:tabs>
+      <w:spacing w:after="0" w:line="240" w:lineRule="auto"/>
+    </w:pPr>
+  </w:style>
+  <w:style w:type="character" w:customStyle="1" w:styleId="EncabezadoCar">
+    <w:name w:val="Encabezado Car"/>
+    <w:basedOn w:val="Fuentedeprrafopredeter"/>
+    <w:link w:val="Encabezado"/>
+    <w:uiPriority w:val="99"/>
+    <w:rsid w:val="00D13A4D"/>
+    <w:rPr>
+      <w:rFonts w:ascii="Calibri" w:eastAsia="Calibri" w:hAnsi="Calibri" w:cs="Calibri"/>
+      <w:kern w:val="0"/>
+      <w:lang w:eastAsia="es-MX"/>
+      <w14:ligatures w14:val="none"/>
+    </w:rPr>
+  </w:style>
+  <w:style w:type="paragraph" w:styleId="Piedepgina">
+    <w:name w:val="footer"/>
+    <w:basedOn w:val="Normal"/>
+    <w:link w:val="PiedepginaCar"/>
+    <w:uiPriority w:val="99"/>
+    <w:unhideWhenUsed/>
+    <w:rsid w:val="00D13A4D"/>
+    <w:pPr>
+      <w:tabs>
+        <w:tab w:val="center" w:pos="4419"/>
+        <w:tab w:val="right" w:pos="8838"/>
+      </w:tabs>
+      <w:spacing w:after="0" w:line="240" w:lineRule="auto"/>
+    </w:pPr>
+  </w:style>
+  <w:style w:type="character" w:customStyle="1" w:styleId="PiedepginaCar">
+    <w:name w:val="Pie de página Car"/>
+    <w:basedOn w:val="Fuentedeprrafopredeter"/>
+    <w:link w:val="Piedepgina"/>
+    <w:uiPriority w:val="99"/>
+    <w:rsid w:val="00D13A4D"/>
+    <w:rPr>
+      <w:rFonts w:ascii="Calibri" w:eastAsia="Calibri" w:hAnsi="Calibri" w:cs="Calibri"/>
+      <w:kern w:val="0"/>
+      <w:lang w:eastAsia="es-MX"/>
+      <w14:ligatures w14:val="none"/>
+    </w:rPr>
+  </w:style>
+  <w:style w:type="character" w:customStyle="1" w:styleId="Ttulo2Car">
+    <w:name w:val="Título 2 Car"/>
+    <w:basedOn w:val="Fuentedeprrafopredeter"/>
+    <w:link w:val="Ttulo2"/>
+    <w:uiPriority w:val="9"/>
+    <w:rsid w:val="003B1732"/>
+    <w:rPr>
+      <w:rFonts w:ascii="Arial" w:eastAsiaTheme="majorEastAsia" w:hAnsi="Arial" w:cstheme="majorBidi"/>
+      <w:kern w:val="0"/>
+      <w:sz w:val="24"/>
+      <w:szCs w:val="26"/>
+      <w:lang w:eastAsia="es-MX"/>
+      <w14:ligatures w14:val="none"/>
+    </w:rPr>
+  </w:style>
+  <w:style w:type="character" w:customStyle="1" w:styleId="Ttulo3Car">
+    <w:name w:val="Título 3 Car"/>
+    <w:basedOn w:val="Fuentedeprrafopredeter"/>
+    <w:link w:val="Ttulo3"/>
+    <w:uiPriority w:val="9"/>
+    <w:rsid w:val="003B1732"/>
+    <w:rPr>
+      <w:rFonts w:ascii="Arial" w:eastAsiaTheme="majorEastAsia" w:hAnsi="Arial" w:cstheme="majorBidi"/>
+      <w:kern w:val="0"/>
+      <w:szCs w:val="24"/>
+      <w:lang w:eastAsia="es-MX"/>
+      <w14:ligatures w14:val="none"/>
+    </w:rPr>
   </w:style>
 </w:styles>
 </file>

</xml_diff>